<commit_message>
Exercise 1 Items 3-4 as numbered steps from course formulas; remove extra commentary in both exercises
Co-Authored-By: Claude Opus 5.5 <noreply@anthropic.com>
Claude-Session: https://claude.ai/code/session_018f4s9PsFznaBLPycqNXRoH
</commit_message>
<xml_diff>
--- a/Exercise-2-Answers.docx
+++ b/Exercise-2-Answers.docx
@@ -481,21 +481,6 @@
           <w:vertAlign w:val="subscript"/>
         </w:rPr>
         <w:t xml:space="preserve">t</w:t>
-      </w:r>
-    </w:p>
-    <w:p>
-      <w:pPr>
-        <w:spacing w:after="100" w:before="0" w:line="252"/>
-        <w:ind w:left="360"/>
-        <w:jc w:val="both"/>
-      </w:pPr>
-      <w:r>
-        <w:rPr>
-          <w:rFonts w:ascii="Times New Roman" w:cs="Times New Roman" w:eastAsia="Times New Roman" w:hAnsi="Times New Roman"/>
-          <w:sz w:val="24"/>
-          <w:szCs w:val="24"/>
-        </w:rPr>
-        <w:t xml:space="preserve">Consumption depends on income (gdp) and on the lending interest rate (lendrate).</w:t>
       </w:r>
     </w:p>
     <w:p>
@@ -1699,67 +1684,6 @@
     </w:p>
     <w:p>
       <w:pPr>
-        <w:spacing w:after="100" w:before="0" w:line="252"/>
-        <w:ind w:left="360"/>
-        <w:jc w:val="both"/>
-      </w:pPr>
-      <w:r>
-        <w:rPr>
-          <w:rFonts w:ascii="Times New Roman" w:cs="Times New Roman" w:eastAsia="Times New Roman" w:hAnsi="Times New Roman"/>
-          <w:sz w:val="24"/>
-          <w:szCs w:val="24"/>
-        </w:rPr>
-        <w:t xml:space="preserve">Estimated equation:  </w:t>
-      </w:r>
-      <w:r>
-        <w:rPr>
-          <w:rFonts w:ascii="Times New Roman" w:cs="Times New Roman" w:eastAsia="Times New Roman" w:hAnsi="Times New Roman"/>
-          <w:i/>
-          <w:iCs/>
-          <w:sz w:val="24"/>
-          <w:szCs w:val="24"/>
-        </w:rPr>
-        <w:t xml:space="preserve">cons</w:t>
-      </w:r>
-      <w:r>
-        <w:rPr>
-          <w:rFonts w:ascii="Times New Roman" w:cs="Times New Roman" w:eastAsia="Times New Roman" w:hAnsi="Times New Roman"/>
-          <w:sz w:val="24"/>
-          <w:szCs w:val="24"/>
-        </w:rPr>
-        <w:t xml:space="preserve">̂ = 539.63 + 0.71 </w:t>
-      </w:r>
-      <w:r>
-        <w:rPr>
-          <w:rFonts w:ascii="Times New Roman" w:cs="Times New Roman" w:eastAsia="Times New Roman" w:hAnsi="Times New Roman"/>
-          <w:i/>
-          <w:iCs/>
-          <w:sz w:val="24"/>
-          <w:szCs w:val="24"/>
-        </w:rPr>
-        <w:t xml:space="preserve">gdp</w:t>
-      </w:r>
-      <w:r>
-        <w:rPr>
-          <w:rFonts w:ascii="Times New Roman" w:cs="Times New Roman" w:eastAsia="Times New Roman" w:hAnsi="Times New Roman"/>
-          <w:sz w:val="24"/>
-          <w:szCs w:val="24"/>
-        </w:rPr>
-        <w:t xml:space="preserve"> − 26.84 </w:t>
-      </w:r>
-      <w:r>
-        <w:rPr>
-          <w:rFonts w:ascii="Times New Roman" w:cs="Times New Roman" w:eastAsia="Times New Roman" w:hAnsi="Times New Roman"/>
-          <w:i/>
-          <w:iCs/>
-          <w:sz w:val="24"/>
-          <w:szCs w:val="24"/>
-        </w:rPr>
-        <w:t xml:space="preserve">lendrate</w:t>
-      </w:r>
-    </w:p>
-    <w:p>
-      <w:pPr>
         <w:keepNext/>
         <w:tabs>
           <w:tab w:val="left" w:pos="360"/>
@@ -2679,21 +2603,6 @@
       <w:pPr>
         <w:spacing w:after="100" w:before="0"/>
       </w:pPr>
-    </w:p>
-    <w:p>
-      <w:pPr>
-        <w:spacing w:after="100" w:before="0" w:line="252"/>
-        <w:ind w:left="360"/>
-        <w:jc w:val="both"/>
-      </w:pPr>
-      <w:r>
-        <w:rPr>
-          <w:rFonts w:ascii="Times New Roman" w:cs="Times New Roman" w:eastAsia="Times New Roman" w:hAnsi="Times New Roman"/>
-          <w:sz w:val="24"/>
-          <w:szCs w:val="24"/>
-        </w:rPr>
-        <w:t xml:space="preserve">The joint test gives Prob&gt;chi2 = 0.0732.</w:t>
-      </w:r>
     </w:p>
     <w:p>
       <w:pPr>
@@ -4298,76 +4207,6 @@
           <w:szCs w:val="24"/>
         </w:rPr>
         <w:t xml:space="preserve">Answer:</w:t>
-      </w:r>
-    </w:p>
-    <w:p>
-      <w:pPr>
-        <w:keepNext/>
-        <w:spacing w:after="100" w:before="0" w:line="252"/>
-        <w:ind w:left="360"/>
-        <w:jc w:val="both"/>
-      </w:pPr>
-      <w:r>
-        <w:rPr>
-          <w:rFonts w:ascii="Times New Roman" w:cs="Times New Roman" w:eastAsia="Times New Roman" w:hAnsi="Times New Roman"/>
-          <w:sz w:val="24"/>
-          <w:szCs w:val="24"/>
-        </w:rPr>
-        <w:t xml:space="preserve">STATA commands used: &lt;</w:t>
-      </w:r>
-      <w:r>
-        <w:rPr>
-          <w:rFonts w:ascii="Times New Roman" w:cs="Times New Roman" w:eastAsia="Times New Roman" w:hAnsi="Times New Roman"/>
-          <w:i/>
-          <w:iCs/>
-          <w:sz w:val="24"/>
-          <w:szCs w:val="24"/>
-        </w:rPr>
-        <w:t xml:space="preserve">predict yhat</w:t>
-      </w:r>
-      <w:r>
-        <w:rPr>
-          <w:rFonts w:ascii="Times New Roman" w:cs="Times New Roman" w:eastAsia="Times New Roman" w:hAnsi="Times New Roman"/>
-          <w:sz w:val="24"/>
-          <w:szCs w:val="24"/>
-        </w:rPr>
-        <w:t xml:space="preserve">&gt;, &lt;</w:t>
-      </w:r>
-      <w:r>
-        <w:rPr>
-          <w:rFonts w:ascii="Times New Roman" w:cs="Times New Roman" w:eastAsia="Times New Roman" w:hAnsi="Times New Roman"/>
-          <w:i/>
-          <w:iCs/>
-          <w:sz w:val="24"/>
-          <w:szCs w:val="24"/>
-        </w:rPr>
-        <w:t xml:space="preserve">generate errorsq = error^2</w:t>
-      </w:r>
-      <w:r>
-        <w:rPr>
-          <w:rFonts w:ascii="Times New Roman" w:cs="Times New Roman" w:eastAsia="Times New Roman" w:hAnsi="Times New Roman"/>
-          <w:sz w:val="24"/>
-          <w:szCs w:val="24"/>
-        </w:rPr>
-        <w:t xml:space="preserve">&gt; and &lt;</w:t>
-      </w:r>
-      <w:r>
-        <w:rPr>
-          <w:rFonts w:ascii="Times New Roman" w:cs="Times New Roman" w:eastAsia="Times New Roman" w:hAnsi="Times New Roman"/>
-          <w:i/>
-          <w:iCs/>
-          <w:sz w:val="24"/>
-          <w:szCs w:val="24"/>
-        </w:rPr>
-        <w:t xml:space="preserve">scatter errorsq yhat</w:t>
-      </w:r>
-      <w:r>
-        <w:rPr>
-          <w:rFonts w:ascii="Times New Roman" w:cs="Times New Roman" w:eastAsia="Times New Roman" w:hAnsi="Times New Roman"/>
-          <w:sz w:val="24"/>
-          <w:szCs w:val="24"/>
-        </w:rPr>
-        <w:t xml:space="preserve">&gt;.</w:t>
       </w:r>
     </w:p>
     <w:p>

</xml_diff>